<commit_message>
updated logics and code improvement
</commit_message>
<xml_diff>
--- a/report/SBMS_Project_Report.docx
+++ b/report/SBMS_Project_Report.docx
@@ -443,25 +443,7 @@
           <w:sz w:val="22"/>
           <w:szCs w:val="22"/>
         </w:rPr>
-        <w:t xml:space="preserve">The main aim of this project was to </w:t>
-      </w:r>
-      <w:proofErr w:type="gramStart"/>
-      <w:r>
-        <w:rPr>
-          <w:rFonts w:ascii="Calibri" w:eastAsia="Calibri" w:hAnsi="Calibri" w:cs="Calibri"/>
-          <w:sz w:val="22"/>
-          <w:szCs w:val="22"/>
-        </w:rPr>
-        <w:t>actually use</w:t>
-      </w:r>
-      <w:proofErr w:type="gramEnd"/>
-      <w:r>
-        <w:rPr>
-          <w:rFonts w:ascii="Calibri" w:eastAsia="Calibri" w:hAnsi="Calibri" w:cs="Calibri"/>
-          <w:sz w:val="22"/>
-          <w:szCs w:val="22"/>
-        </w:rPr>
-        <w:t xml:space="preserve"> the data structures and algorithms I studied in class instead of just learning them on paper. Things like arrays, structures, searching, sorting, and file handling are all used somewhere in this project. I also used Git and GitHub to keep track of my code while I was building it.</w:t>
+        <w:t>The main aim of this project was to actually use the data structures and algorithms I studied in class instead of just learning them on paper. Things like arrays, structures, searching, sorting, file handling, linked lists and queues are all used somewhere in this project. I also used Git and GitHub to keep track of my code while I was building it.</w:t>
       </w:r>
     </w:p>
     <w:p>
@@ -512,25 +494,7 @@
           <w:sz w:val="22"/>
           <w:szCs w:val="22"/>
         </w:rPr>
-        <w:t xml:space="preserve">The problem I chose to solve with SBMS is: how can a console-based C program manage customer accounts, handle everyday banking transactions such as deposit, withdrawal and transfer, and </w:t>
-      </w:r>
-      <w:proofErr w:type="gramStart"/>
-      <w:r>
-        <w:rPr>
-          <w:rFonts w:ascii="Calibri" w:eastAsia="Calibri" w:hAnsi="Calibri" w:cs="Calibri"/>
-          <w:sz w:val="22"/>
-          <w:szCs w:val="22"/>
-        </w:rPr>
-        <w:t>still keep</w:t>
-      </w:r>
-      <w:proofErr w:type="gramEnd"/>
-      <w:r>
-        <w:rPr>
-          <w:rFonts w:ascii="Calibri" w:eastAsia="Calibri" w:hAnsi="Calibri" w:cs="Calibri"/>
-          <w:sz w:val="22"/>
-          <w:szCs w:val="22"/>
-        </w:rPr>
-        <w:t xml:space="preserve"> the data safe even after the program is closed and reopened? The project also had to show that I can apply searching, sorting and other DSA concepts to a real, working problem instead of a toy example.</w:t>
+        <w:t>The problem I chose to solve with SBMS is: how can a console-based C program manage customer accounts, handle everyday banking transactions such as deposit, withdrawal and transfer, and still keep the data safe even after the program is closed and reopened? The project also had to show that I can apply searching, sorting and other DSA concepts to a real, working problem instead of a toy example.</w:t>
       </w:r>
     </w:p>
     <w:p>
@@ -683,7 +647,7 @@
           <w:szCs w:val="22"/>
         </w:rPr>
         <w:lastRenderedPageBreak/>
-        <w:t>A DSA module lets the admin run linear search, binary search and two sorting operations on the customer data.</w:t>
+        <w:t>A DSA module lets the admin run linear search, binary search and two sorting operations, a linked list traversal and a queue-based service request module on the customer data.</w:t>
       </w:r>
     </w:p>
     <w:p>
@@ -805,12 +769,6 @@
         <w:gridCol w:w="1000"/>
       </w:tblGrid>
       <w:tr>
-        <w:tblPrEx>
-          <w:tblCellMar>
-            <w:top w:w="0" w:type="dxa"/>
-            <w:bottom w:w="0" w:type="dxa"/>
-          </w:tblCellMar>
-        </w:tblPrEx>
         <w:tc>
           <w:tcPr>
             <w:tcW w:w="1300" w:type="dxa"/>
@@ -901,12 +859,6 @@
         </w:tc>
       </w:tr>
       <w:tr>
-        <w:tblPrEx>
-          <w:tblCellMar>
-            <w:top w:w="0" w:type="dxa"/>
-            <w:bottom w:w="0" w:type="dxa"/>
-          </w:tblCellMar>
-        </w:tblPrEx>
         <w:tc>
           <w:tcPr>
             <w:tcW w:w="1300" w:type="dxa"/>
@@ -985,12 +937,6 @@
         </w:tc>
       </w:tr>
       <w:tr>
-        <w:tblPrEx>
-          <w:tblCellMar>
-            <w:top w:w="0" w:type="dxa"/>
-            <w:bottom w:w="0" w:type="dxa"/>
-          </w:tblCellMar>
-        </w:tblPrEx>
         <w:tc>
           <w:tcPr>
             <w:tcW w:w="1300" w:type="dxa"/>
@@ -1069,12 +1015,6 @@
         </w:tc>
       </w:tr>
       <w:tr>
-        <w:tblPrEx>
-          <w:tblCellMar>
-            <w:top w:w="0" w:type="dxa"/>
-            <w:bottom w:w="0" w:type="dxa"/>
-          </w:tblCellMar>
-        </w:tblPrEx>
         <w:tc>
           <w:tcPr>
             <w:tcW w:w="1300" w:type="dxa"/>
@@ -1153,12 +1093,6 @@
         </w:tc>
       </w:tr>
       <w:tr>
-        <w:tblPrEx>
-          <w:tblCellMar>
-            <w:top w:w="0" w:type="dxa"/>
-            <w:bottom w:w="0" w:type="dxa"/>
-          </w:tblCellMar>
-        </w:tblPrEx>
         <w:tc>
           <w:tcPr>
             <w:tcW w:w="1300" w:type="dxa"/>
@@ -1237,12 +1171,6 @@
         </w:tc>
       </w:tr>
       <w:tr>
-        <w:tblPrEx>
-          <w:tblCellMar>
-            <w:top w:w="0" w:type="dxa"/>
-            <w:bottom w:w="0" w:type="dxa"/>
-          </w:tblCellMar>
-        </w:tblPrEx>
         <w:tc>
           <w:tcPr>
             <w:tcW w:w="1300" w:type="dxa"/>
@@ -1321,12 +1249,6 @@
         </w:tc>
       </w:tr>
       <w:tr>
-        <w:tblPrEx>
-          <w:tblCellMar>
-            <w:top w:w="0" w:type="dxa"/>
-            <w:bottom w:w="0" w:type="dxa"/>
-          </w:tblCellMar>
-        </w:tblPrEx>
         <w:tc>
           <w:tcPr>
             <w:tcW w:w="1300" w:type="dxa"/>
@@ -1361,21 +1283,7 @@
               <w:rPr>
                 <w:rFonts w:ascii="Calibri" w:eastAsia="Calibri" w:hAnsi="Calibri" w:cs="Calibri"/>
               </w:rPr>
-              <w:t xml:space="preserve">As a user, I want my data stored in a </w:t>
-            </w:r>
-            <w:proofErr w:type="gramStart"/>
-            <w:r>
-              <w:rPr>
-                <w:rFonts w:ascii="Calibri" w:eastAsia="Calibri" w:hAnsi="Calibri" w:cs="Calibri"/>
-              </w:rPr>
-              <w:t>file</w:t>
-            </w:r>
-            <w:proofErr w:type="gramEnd"/>
-            <w:r>
-              <w:rPr>
-                <w:rFonts w:ascii="Calibri" w:eastAsia="Calibri" w:hAnsi="Calibri" w:cs="Calibri"/>
-              </w:rPr>
-              <w:t xml:space="preserve"> so it is not lost after closing the app.</w:t>
+              <w:t>As a user, I want my data stored in a file so it is not lost after closing the app.</w:t>
             </w:r>
           </w:p>
         </w:tc>
@@ -1419,12 +1327,6 @@
         </w:tc>
       </w:tr>
       <w:tr>
-        <w:tblPrEx>
-          <w:tblCellMar>
-            <w:top w:w="0" w:type="dxa"/>
-            <w:bottom w:w="0" w:type="dxa"/>
-          </w:tblCellMar>
-        </w:tblPrEx>
         <w:tc>
           <w:tcPr>
             <w:tcW w:w="1300" w:type="dxa"/>
@@ -1440,7 +1342,13 @@
               <w:rPr>
                 <w:rFonts w:ascii="Calibri" w:eastAsia="Calibri" w:hAnsi="Calibri" w:cs="Calibri"/>
               </w:rPr>
-              <w:t>US-09</w:t>
+              <w:t>US-0</w:t>
+            </w:r>
+            <w:r>
+              <w:rPr>
+                <w:rFonts w:ascii="Calibri" w:eastAsia="Calibri" w:hAnsi="Calibri" w:cs="Calibri"/>
+              </w:rPr>
+              <w:t>7</w:t>
             </w:r>
           </w:p>
         </w:tc>
@@ -1503,12 +1411,6 @@
         </w:tc>
       </w:tr>
       <w:tr>
-        <w:tblPrEx>
-          <w:tblCellMar>
-            <w:top w:w="0" w:type="dxa"/>
-            <w:bottom w:w="0" w:type="dxa"/>
-          </w:tblCellMar>
-        </w:tblPrEx>
         <w:tc>
           <w:tcPr>
             <w:tcW w:w="1300" w:type="dxa"/>
@@ -1524,7 +1426,13 @@
               <w:rPr>
                 <w:rFonts w:ascii="Calibri" w:eastAsia="Calibri" w:hAnsi="Calibri" w:cs="Calibri"/>
               </w:rPr>
-              <w:t>US-10</w:t>
+              <w:t>US-</w:t>
+            </w:r>
+            <w:r>
+              <w:rPr>
+                <w:rFonts w:ascii="Calibri" w:eastAsia="Calibri" w:hAnsi="Calibri" w:cs="Calibri"/>
+              </w:rPr>
+              <w:t>8</w:t>
             </w:r>
           </w:p>
         </w:tc>
@@ -1601,12 +1509,6 @@
         </w:tc>
       </w:tr>
       <w:tr>
-        <w:tblPrEx>
-          <w:tblCellMar>
-            <w:top w:w="0" w:type="dxa"/>
-            <w:bottom w:w="0" w:type="dxa"/>
-          </w:tblCellMar>
-        </w:tblPrEx>
         <w:tc>
           <w:tcPr>
             <w:tcW w:w="1300" w:type="dxa"/>
@@ -1622,7 +1524,13 @@
               <w:rPr>
                 <w:rFonts w:ascii="Calibri" w:eastAsia="Calibri" w:hAnsi="Calibri" w:cs="Calibri"/>
               </w:rPr>
-              <w:t>US-13</w:t>
+              <w:t>US-</w:t>
+            </w:r>
+            <w:r>
+              <w:rPr>
+                <w:rFonts w:ascii="Calibri" w:eastAsia="Calibri" w:hAnsi="Calibri" w:cs="Calibri"/>
+              </w:rPr>
+              <w:t>9</w:t>
             </w:r>
           </w:p>
         </w:tc>
@@ -1816,7 +1724,7 @@
           <w:sz w:val="22"/>
           <w:szCs w:val="22"/>
         </w:rPr>
-        <w:t>dsa.c – contains the searching and sorting operations used on customer records.</w:t>
+        <w:t>dsa.c – contains the searching, sorting, linked list traversal and queue-based service request operations used on customer records.</w:t>
       </w:r>
     </w:p>
     <w:p>
@@ -1982,12 +1890,6 @@
         <w:gridCol w:w="5200"/>
       </w:tblGrid>
       <w:tr>
-        <w:tblPrEx>
-          <w:tblCellMar>
-            <w:top w:w="0" w:type="dxa"/>
-            <w:bottom w:w="0" w:type="dxa"/>
-          </w:tblCellMar>
-        </w:tblPrEx>
         <w:tc>
           <w:tcPr>
             <w:tcW w:w="3000" w:type="dxa"/>
@@ -2034,12 +1936,6 @@
         </w:tc>
       </w:tr>
       <w:tr>
-        <w:tblPrEx>
-          <w:tblCellMar>
-            <w:top w:w="0" w:type="dxa"/>
-            <w:bottom w:w="0" w:type="dxa"/>
-          </w:tblCellMar>
-        </w:tblPrEx>
         <w:tc>
           <w:tcPr>
             <w:tcW w:w="3000" w:type="dxa"/>
@@ -2080,12 +1976,6 @@
         </w:tc>
       </w:tr>
       <w:tr>
-        <w:tblPrEx>
-          <w:tblCellMar>
-            <w:top w:w="0" w:type="dxa"/>
-            <w:bottom w:w="0" w:type="dxa"/>
-          </w:tblCellMar>
-        </w:tblPrEx>
         <w:tc>
           <w:tcPr>
             <w:tcW w:w="3000" w:type="dxa"/>
@@ -2126,12 +2016,6 @@
         </w:tc>
       </w:tr>
       <w:tr>
-        <w:tblPrEx>
-          <w:tblCellMar>
-            <w:top w:w="0" w:type="dxa"/>
-            <w:bottom w:w="0" w:type="dxa"/>
-          </w:tblCellMar>
-        </w:tblPrEx>
         <w:tc>
           <w:tcPr>
             <w:tcW w:w="3000" w:type="dxa"/>
@@ -2172,12 +2056,6 @@
         </w:tc>
       </w:tr>
       <w:tr>
-        <w:tblPrEx>
-          <w:tblCellMar>
-            <w:top w:w="0" w:type="dxa"/>
-            <w:bottom w:w="0" w:type="dxa"/>
-          </w:tblCellMar>
-        </w:tblPrEx>
         <w:tc>
           <w:tcPr>
             <w:tcW w:w="3000" w:type="dxa"/>
@@ -2218,12 +2096,6 @@
         </w:tc>
       </w:tr>
       <w:tr>
-        <w:tblPrEx>
-          <w:tblCellMar>
-            <w:top w:w="0" w:type="dxa"/>
-            <w:bottom w:w="0" w:type="dxa"/>
-          </w:tblCellMar>
-        </w:tblPrEx>
         <w:tc>
           <w:tcPr>
             <w:tcW w:w="3000" w:type="dxa"/>
@@ -2264,12 +2136,6 @@
         </w:tc>
       </w:tr>
       <w:tr>
-        <w:tblPrEx>
-          <w:tblCellMar>
-            <w:top w:w="0" w:type="dxa"/>
-            <w:bottom w:w="0" w:type="dxa"/>
-          </w:tblCellMar>
-        </w:tblPrEx>
         <w:tc>
           <w:tcPr>
             <w:tcW w:w="3000" w:type="dxa"/>
@@ -2310,12 +2176,6 @@
         </w:tc>
       </w:tr>
       <w:tr>
-        <w:tblPrEx>
-          <w:tblCellMar>
-            <w:top w:w="0" w:type="dxa"/>
-            <w:bottom w:w="0" w:type="dxa"/>
-          </w:tblCellMar>
-        </w:tblPrEx>
         <w:tc>
           <w:tcPr>
             <w:tcW w:w="3000" w:type="dxa"/>
@@ -2331,6 +2191,87 @@
               <w:rPr>
                 <w:rFonts w:ascii="Calibri" w:eastAsia="Calibri" w:hAnsi="Calibri" w:cs="Calibri"/>
               </w:rPr>
+              <w:t>Linked List</w:t>
+            </w:r>
+          </w:p>
+        </w:tc>
+        <w:tc>
+          <w:tcPr>
+            <w:tcW w:w="5200" w:type="dxa"/>
+            <w:tcMar>
+              <w:top w:w="80" w:type="dxa"/>
+              <w:left w:w="100" w:type="dxa"/>
+              <w:bottom w:w="80" w:type="dxa"/>
+              <w:right w:w="100" w:type="dxa"/>
+            </w:tcMar>
+          </w:tcPr>
+          <w:p>
+            <w:r>
+              <w:rPr>
+                <w:rFonts w:ascii="Calibri" w:eastAsia="Calibri" w:hAnsi="Calibri" w:cs="Calibri"/>
+              </w:rPr>
+              <w:t>Used in buildCustomerLinkedList() to load customer.dat into a dynamically allocated singly linked list, traversed and displayed via displayCustomersLinkedList().</w:t>
+            </w:r>
+          </w:p>
+        </w:tc>
+      </w:tr>
+      <w:tr>
+        <w:tc>
+          <w:tcPr>
+            <w:tcW w:w="3000" w:type="dxa"/>
+            <w:tcMar>
+              <w:top w:w="80" w:type="dxa"/>
+              <w:left w:w="100" w:type="dxa"/>
+              <w:bottom w:w="80" w:type="dxa"/>
+              <w:right w:w="100" w:type="dxa"/>
+            </w:tcMar>
+          </w:tcPr>
+          <w:p>
+            <w:r>
+              <w:rPr>
+                <w:rFonts w:ascii="Calibri" w:eastAsia="Calibri" w:hAnsi="Calibri" w:cs="Calibri"/>
+              </w:rPr>
+              <w:t>Queue</w:t>
+            </w:r>
+          </w:p>
+        </w:tc>
+        <w:tc>
+          <w:tcPr>
+            <w:tcW w:w="5200" w:type="dxa"/>
+            <w:tcMar>
+              <w:top w:w="80" w:type="dxa"/>
+              <w:left w:w="100" w:type="dxa"/>
+              <w:bottom w:w="80" w:type="dxa"/>
+              <w:right w:w="100" w:type="dxa"/>
+            </w:tcMar>
+          </w:tcPr>
+          <w:p>
+            <w:r>
+              <w:rPr>
+                <w:rFonts w:ascii="Calibri" w:eastAsia="Calibri" w:hAnsi="Calibri" w:cs="Calibri"/>
+              </w:rPr>
+              <w:t>Used in the Queue module (enqueueRequest(), dequeueRequest()) to manage customer service requests in first-in-first-out order, persisted in queue.dat.</w:t>
+            </w:r>
+          </w:p>
+        </w:tc>
+      </w:tr>
+      <w:tr>
+        <w:tc>
+          <w:tcPr>
+            <w:tcW w:w="3000" w:type="dxa"/>
+            <w:tcMar>
+              <w:top w:w="80" w:type="dxa"/>
+              <w:left w:w="100" w:type="dxa"/>
+              <w:bottom w:w="80" w:type="dxa"/>
+              <w:right w:w="100" w:type="dxa"/>
+            </w:tcMar>
+          </w:tcPr>
+          <w:p>
+            <w:r>
+              <w:rPr>
+                <w:rFonts w:ascii="Calibri" w:eastAsia="Calibri" w:hAnsi="Calibri" w:cs="Calibri"/>
+              </w:rPr>
+              <w:lastRenderedPageBreak/>
               <w:t>Pointers</w:t>
             </w:r>
           </w:p>
@@ -2392,7 +2333,6 @@
           <w:sz w:val="22"/>
           <w:szCs w:val="22"/>
         </w:rPr>
-        <w:lastRenderedPageBreak/>
         <w:t>Linear search is used to find a customer by account number without needing the data to be sorted. The array of customers loaded from the file is checked one by one from the start until a match is found or the list ends.</w:t>
       </w:r>
     </w:p>
@@ -2475,6 +2415,69 @@
           <w:szCs w:val="22"/>
         </w:rPr>
         <w:t>These are not sorting or searching algorithms, but they follow a clear step-by-step logic: find the customer record using findCustomer(), check that the account is not frozen, validate the amount entered, update the balance, save the updated record back to the file, and finally log the transaction in transaction.dat with a new transaction ID.</w:t>
+      </w:r>
+    </w:p>
+    <w:p>
+      <w:pPr>
+        <w:pStyle w:val="Heading2"/>
+        <w:spacing w:before="200" w:after="100"/>
+      </w:pPr>
+      <w:r>
+        <w:rPr>
+          <w:rFonts w:ascii="Calibri" w:eastAsia="Calibri" w:hAnsi="Calibri" w:cs="Calibri"/>
+          <w:b/>
+          <w:bCs/>
+        </w:rPr>
+        <w:t>6.5 Linked List Traversal</w:t>
+      </w:r>
+    </w:p>
+    <w:p>
+      <w:pPr>
+        <w:spacing w:after="160" w:line="300" w:lineRule="auto"/>
+      </w:pPr>
+      <w:r>
+        <w:rPr>
+          <w:rFonts w:ascii="Calibri" w:eastAsia="Calibri" w:hAnsi="Calibri" w:cs="Calibri"/>
+          <w:sz w:val="22"/>
+          <w:szCs w:val="22"/>
+        </w:rPr>
+        <w:t>Customer records are read from customer.dat into a dynamically allocated singly linked list, where each node (CustomerNode) holds one customer's data and a pointer to the next node. buildCustomerLinkedList() constructs the list node by node while reading the file, displayCustomersLinkedList() walks the list from head to tail to display every record along with a running count, and freeCustomerLinkedList() releases all allocated memory afterwards.</w:t>
+      </w:r>
+    </w:p>
+    <w:p>
+      <w:pPr>
+        <w:pStyle w:val="Heading2"/>
+        <w:spacing w:before="200" w:after="100"/>
+      </w:pPr>
+      <w:r>
+        <w:rPr>
+          <w:rFonts w:ascii="Calibri" w:eastAsia="Calibri" w:hAnsi="Calibri" w:cs="Calibri"/>
+          <w:b/>
+          <w:bCs/>
+        </w:rPr>
+        <w:t>6.6 Queue (FIFO) for Service Requests</w:t>
+      </w:r>
+    </w:p>
+    <w:p>
+      <w:pPr>
+        <w:spacing w:after="160" w:line="300" w:lineRule="auto"/>
+      </w:pPr>
+      <w:r>
+        <w:rPr>
+          <w:rFonts w:ascii="Calibri" w:eastAsia="Calibri" w:hAnsi="Calibri" w:cs="Calibri"/>
+          <w:sz w:val="22"/>
+          <w:szCs w:val="22"/>
+        </w:rPr>
+        <w:t xml:space="preserve">A linked-list based queue, with separate front and rear pointers, is used to manage customer service requests such as cheque book or statement requests. enqueueRequest() adds a new request at the rear of the queue, and dequeueRequest() removes and returns the request at the front, so requests are always processed in the order they were received (First-In-First-Out). The queue's state is loaded from </w:t>
+      </w:r>
+      <w:r>
+        <w:rPr>
+          <w:rFonts w:ascii="Calibri" w:eastAsia="Calibri" w:hAnsi="Calibri" w:cs="Calibri"/>
+          <w:sz w:val="22"/>
+          <w:szCs w:val="22"/>
+        </w:rPr>
+        <w:lastRenderedPageBreak/>
+        <w:t>and saved back to a dedicated binary file, queue.dat, so pending requests are not lost between program runs.</w:t>
       </w:r>
     </w:p>
     <w:p>
@@ -2638,7 +2641,6 @@
           <w:sz w:val="22"/>
           <w:szCs w:val="22"/>
         </w:rPr>
-        <w:lastRenderedPageBreak/>
         <w:t>Every transaction (deposit, withdraw, transfer) automatically creates an entry in transaction.dat with a unique transaction ID, so a mini statement can be generated later.</w:t>
       </w:r>
     </w:p>
@@ -2657,25 +2659,25 @@
           <w:sz w:val="22"/>
           <w:szCs w:val="22"/>
         </w:rPr>
-        <w:t xml:space="preserve">Basic validation is added everywhere, for example rejecting a deposit/withdrawal amount that is zero or </w:t>
-      </w:r>
-      <w:proofErr w:type="gramStart"/>
-      <w:r>
-        <w:rPr>
-          <w:rFonts w:ascii="Calibri" w:eastAsia="Calibri" w:hAnsi="Calibri" w:cs="Calibri"/>
-          <w:sz w:val="22"/>
-          <w:szCs w:val="22"/>
-        </w:rPr>
-        <w:t>negative, and</w:t>
-      </w:r>
-      <w:proofErr w:type="gramEnd"/>
-      <w:r>
-        <w:rPr>
-          <w:rFonts w:ascii="Calibri" w:eastAsia="Calibri" w:hAnsi="Calibri" w:cs="Calibri"/>
-          <w:sz w:val="22"/>
-          <w:szCs w:val="22"/>
-        </w:rPr>
-        <w:t xml:space="preserve"> blocking transactions on frozen accounts.</w:t>
+        <w:t>Basic validation is added everywhere, for example rejecting a deposit/withdrawal amount that is zero or negative, and blocking transactions on frozen accounts.</w:t>
+      </w:r>
+    </w:p>
+    <w:p>
+      <w:pPr>
+        <w:pStyle w:val="ListParagraph"/>
+        <w:numPr>
+          <w:ilvl w:val="0"/>
+          <w:numId w:val="2"/>
+        </w:numPr>
+        <w:spacing w:after="80"/>
+      </w:pPr>
+      <w:r>
+        <w:rPr>
+          <w:rFonts w:ascii="Calibri" w:eastAsia="Calibri" w:hAnsi="Calibri" w:cs="Calibri"/>
+          <w:sz w:val="22"/>
+          <w:szCs w:val="22"/>
+        </w:rPr>
+        <w:t>Service requests added through the Queue module are persisted to a dedicated binary file, data/queue.dat, using the same load-modify-save pattern as the other data files.</w:t>
       </w:r>
     </w:p>
     <w:p>
@@ -2727,12 +2729,6 @@
         <w:gridCol w:w="2300"/>
       </w:tblGrid>
       <w:tr>
-        <w:tblPrEx>
-          <w:tblCellMar>
-            <w:top w:w="0" w:type="dxa"/>
-            <w:bottom w:w="0" w:type="dxa"/>
-          </w:tblCellMar>
-        </w:tblPrEx>
         <w:tc>
           <w:tcPr>
             <w:tcW w:w="700" w:type="dxa"/>
@@ -2823,12 +2819,6 @@
         </w:tc>
       </w:tr>
       <w:tr>
-        <w:tblPrEx>
-          <w:tblCellMar>
-            <w:top w:w="0" w:type="dxa"/>
-            <w:bottom w:w="0" w:type="dxa"/>
-          </w:tblCellMar>
-        </w:tblPrEx>
         <w:tc>
           <w:tcPr>
             <w:tcW w:w="700" w:type="dxa"/>
@@ -2907,12 +2897,6 @@
         </w:tc>
       </w:tr>
       <w:tr>
-        <w:tblPrEx>
-          <w:tblCellMar>
-            <w:top w:w="0" w:type="dxa"/>
-            <w:bottom w:w="0" w:type="dxa"/>
-          </w:tblCellMar>
-        </w:tblPrEx>
         <w:tc>
           <w:tcPr>
             <w:tcW w:w="700" w:type="dxa"/>
@@ -2991,12 +2975,6 @@
         </w:tc>
       </w:tr>
       <w:tr>
-        <w:tblPrEx>
-          <w:tblCellMar>
-            <w:top w:w="0" w:type="dxa"/>
-            <w:bottom w:w="0" w:type="dxa"/>
-          </w:tblCellMar>
-        </w:tblPrEx>
         <w:tc>
           <w:tcPr>
             <w:tcW w:w="700" w:type="dxa"/>
@@ -3075,12 +3053,6 @@
         </w:tc>
       </w:tr>
       <w:tr>
-        <w:tblPrEx>
-          <w:tblCellMar>
-            <w:top w:w="0" w:type="dxa"/>
-            <w:bottom w:w="0" w:type="dxa"/>
-          </w:tblCellMar>
-        </w:tblPrEx>
         <w:tc>
           <w:tcPr>
             <w:tcW w:w="700" w:type="dxa"/>
@@ -3096,6 +3068,7 @@
               <w:rPr>
                 <w:rFonts w:ascii="Calibri" w:eastAsia="Calibri" w:hAnsi="Calibri" w:cs="Calibri"/>
               </w:rPr>
+              <w:lastRenderedPageBreak/>
               <w:t>4</w:t>
             </w:r>
           </w:p>
@@ -3159,12 +3132,6 @@
         </w:tc>
       </w:tr>
       <w:tr>
-        <w:tblPrEx>
-          <w:tblCellMar>
-            <w:top w:w="0" w:type="dxa"/>
-            <w:bottom w:w="0" w:type="dxa"/>
-          </w:tblCellMar>
-        </w:tblPrEx>
         <w:tc>
           <w:tcPr>
             <w:tcW w:w="700" w:type="dxa"/>
@@ -3243,12 +3210,6 @@
         </w:tc>
       </w:tr>
       <w:tr>
-        <w:tblPrEx>
-          <w:tblCellMar>
-            <w:top w:w="0" w:type="dxa"/>
-            <w:bottom w:w="0" w:type="dxa"/>
-          </w:tblCellMar>
-        </w:tblPrEx>
         <w:tc>
           <w:tcPr>
             <w:tcW w:w="700" w:type="dxa"/>
@@ -3327,12 +3288,6 @@
         </w:tc>
       </w:tr>
       <w:tr>
-        <w:tblPrEx>
-          <w:tblCellMar>
-            <w:top w:w="0" w:type="dxa"/>
-            <w:bottom w:w="0" w:type="dxa"/>
-          </w:tblCellMar>
-        </w:tblPrEx>
         <w:tc>
           <w:tcPr>
             <w:tcW w:w="700" w:type="dxa"/>
@@ -3411,12 +3366,6 @@
         </w:tc>
       </w:tr>
       <w:tr>
-        <w:tblPrEx>
-          <w:tblCellMar>
-            <w:top w:w="0" w:type="dxa"/>
-            <w:bottom w:w="0" w:type="dxa"/>
-          </w:tblCellMar>
-        </w:tblPrEx>
         <w:tc>
           <w:tcPr>
             <w:tcW w:w="700" w:type="dxa"/>
@@ -3495,12 +3444,6 @@
         </w:tc>
       </w:tr>
       <w:tr>
-        <w:tblPrEx>
-          <w:tblCellMar>
-            <w:top w:w="0" w:type="dxa"/>
-            <w:bottom w:w="0" w:type="dxa"/>
-          </w:tblCellMar>
-        </w:tblPrEx>
         <w:tc>
           <w:tcPr>
             <w:tcW w:w="700" w:type="dxa"/>
@@ -3579,12 +3522,6 @@
         </w:tc>
       </w:tr>
       <w:tr>
-        <w:tblPrEx>
-          <w:tblCellMar>
-            <w:top w:w="0" w:type="dxa"/>
-            <w:bottom w:w="0" w:type="dxa"/>
-          </w:tblCellMar>
-        </w:tblPrEx>
         <w:tc>
           <w:tcPr>
             <w:tcW w:w="700" w:type="dxa"/>
@@ -3638,21 +3575,241 @@
               <w:rPr>
                 <w:rFonts w:ascii="Calibri" w:eastAsia="Calibri" w:hAnsi="Calibri" w:cs="Calibri"/>
               </w:rPr>
-              <w:t xml:space="preserve">Previously added records </w:t>
-            </w:r>
-            <w:proofErr w:type="gramStart"/>
-            <w:r>
-              <w:rPr>
-                <w:rFonts w:ascii="Calibri" w:eastAsia="Calibri" w:hAnsi="Calibri" w:cs="Calibri"/>
-              </w:rPr>
-              <w:t>are</w:t>
-            </w:r>
-            <w:proofErr w:type="gramEnd"/>
-            <w:r>
-              <w:rPr>
-                <w:rFonts w:ascii="Calibri" w:eastAsia="Calibri" w:hAnsi="Calibri" w:cs="Calibri"/>
-              </w:rPr>
-              <w:t xml:space="preserve"> still available</w:t>
+              <w:t>Previously added records are still available</w:t>
+            </w:r>
+          </w:p>
+        </w:tc>
+        <w:tc>
+          <w:tcPr>
+            <w:tcW w:w="2300" w:type="dxa"/>
+            <w:tcMar>
+              <w:top w:w="80" w:type="dxa"/>
+              <w:left w:w="100" w:type="dxa"/>
+              <w:bottom w:w="80" w:type="dxa"/>
+              <w:right w:w="100" w:type="dxa"/>
+            </w:tcMar>
+          </w:tcPr>
+          <w:p>
+            <w:r>
+              <w:rPr>
+                <w:rFonts w:ascii="Calibri" w:eastAsia="Calibri" w:hAnsi="Calibri" w:cs="Calibri"/>
+              </w:rPr>
+              <w:t>As expected</w:t>
+            </w:r>
+          </w:p>
+        </w:tc>
+      </w:tr>
+      <w:tr>
+        <w:tc>
+          <w:tcPr>
+            <w:tcW w:w="700" w:type="dxa"/>
+            <w:tcMar>
+              <w:top w:w="80" w:type="dxa"/>
+              <w:left w:w="100" w:type="dxa"/>
+              <w:bottom w:w="80" w:type="dxa"/>
+              <w:right w:w="100" w:type="dxa"/>
+            </w:tcMar>
+          </w:tcPr>
+          <w:p>
+            <w:r>
+              <w:rPr>
+                <w:rFonts w:ascii="Calibri" w:eastAsia="Calibri" w:hAnsi="Calibri" w:cs="Calibri"/>
+              </w:rPr>
+              <w:t>11</w:t>
+            </w:r>
+          </w:p>
+        </w:tc>
+        <w:tc>
+          <w:tcPr>
+            <w:tcW w:w="3300" w:type="dxa"/>
+            <w:tcMar>
+              <w:top w:w="80" w:type="dxa"/>
+              <w:left w:w="100" w:type="dxa"/>
+              <w:bottom w:w="80" w:type="dxa"/>
+              <w:right w:w="100" w:type="dxa"/>
+            </w:tcMar>
+          </w:tcPr>
+          <w:p>
+            <w:r>
+              <w:rPr>
+                <w:rFonts w:ascii="Calibri" w:eastAsia="Calibri" w:hAnsi="Calibri" w:cs="Calibri"/>
+              </w:rPr>
+              <w:t>View all customers using Linked List</w:t>
+            </w:r>
+          </w:p>
+        </w:tc>
+        <w:tc>
+          <w:tcPr>
+            <w:tcW w:w="2500" w:type="dxa"/>
+            <w:tcMar>
+              <w:top w:w="80" w:type="dxa"/>
+              <w:left w:w="100" w:type="dxa"/>
+              <w:bottom w:w="80" w:type="dxa"/>
+              <w:right w:w="100" w:type="dxa"/>
+            </w:tcMar>
+          </w:tcPr>
+          <w:p>
+            <w:r>
+              <w:rPr>
+                <w:rFonts w:ascii="Calibri" w:eastAsia="Calibri" w:hAnsi="Calibri" w:cs="Calibri"/>
+              </w:rPr>
+              <w:t>All customer records displayed via list traversal, correct total count shown</w:t>
+            </w:r>
+          </w:p>
+        </w:tc>
+        <w:tc>
+          <w:tcPr>
+            <w:tcW w:w="2300" w:type="dxa"/>
+            <w:tcMar>
+              <w:top w:w="80" w:type="dxa"/>
+              <w:left w:w="100" w:type="dxa"/>
+              <w:bottom w:w="80" w:type="dxa"/>
+              <w:right w:w="100" w:type="dxa"/>
+            </w:tcMar>
+          </w:tcPr>
+          <w:p>
+            <w:r>
+              <w:rPr>
+                <w:rFonts w:ascii="Calibri" w:eastAsia="Calibri" w:hAnsi="Calibri" w:cs="Calibri"/>
+              </w:rPr>
+              <w:t>As expected</w:t>
+            </w:r>
+          </w:p>
+        </w:tc>
+      </w:tr>
+      <w:tr>
+        <w:tc>
+          <w:tcPr>
+            <w:tcW w:w="700" w:type="dxa"/>
+            <w:tcMar>
+              <w:top w:w="80" w:type="dxa"/>
+              <w:left w:w="100" w:type="dxa"/>
+              <w:bottom w:w="80" w:type="dxa"/>
+              <w:right w:w="100" w:type="dxa"/>
+            </w:tcMar>
+          </w:tcPr>
+          <w:p>
+            <w:r>
+              <w:rPr>
+                <w:rFonts w:ascii="Calibri" w:eastAsia="Calibri" w:hAnsi="Calibri" w:cs="Calibri"/>
+              </w:rPr>
+              <w:t>12</w:t>
+            </w:r>
+          </w:p>
+        </w:tc>
+        <w:tc>
+          <w:tcPr>
+            <w:tcW w:w="3300" w:type="dxa"/>
+            <w:tcMar>
+              <w:top w:w="80" w:type="dxa"/>
+              <w:left w:w="100" w:type="dxa"/>
+              <w:bottom w:w="80" w:type="dxa"/>
+              <w:right w:w="100" w:type="dxa"/>
+            </w:tcMar>
+          </w:tcPr>
+          <w:p>
+            <w:r>
+              <w:rPr>
+                <w:rFonts w:ascii="Calibri" w:eastAsia="Calibri" w:hAnsi="Calibri" w:cs="Calibri"/>
+              </w:rPr>
+              <w:t>Add a service request (Enqueue)</w:t>
+            </w:r>
+          </w:p>
+        </w:tc>
+        <w:tc>
+          <w:tcPr>
+            <w:tcW w:w="2500" w:type="dxa"/>
+            <w:tcMar>
+              <w:top w:w="80" w:type="dxa"/>
+              <w:left w:w="100" w:type="dxa"/>
+              <w:bottom w:w="80" w:type="dxa"/>
+              <w:right w:w="100" w:type="dxa"/>
+            </w:tcMar>
+          </w:tcPr>
+          <w:p>
+            <w:r>
+              <w:rPr>
+                <w:rFonts w:ascii="Calibri" w:eastAsia="Calibri" w:hAnsi="Calibri" w:cs="Calibri"/>
+              </w:rPr>
+              <w:t>Request added to queue.dat with a new request ID, visible in View Queue</w:t>
+            </w:r>
+          </w:p>
+        </w:tc>
+        <w:tc>
+          <w:tcPr>
+            <w:tcW w:w="2300" w:type="dxa"/>
+            <w:tcMar>
+              <w:top w:w="80" w:type="dxa"/>
+              <w:left w:w="100" w:type="dxa"/>
+              <w:bottom w:w="80" w:type="dxa"/>
+              <w:right w:w="100" w:type="dxa"/>
+            </w:tcMar>
+          </w:tcPr>
+          <w:p>
+            <w:r>
+              <w:rPr>
+                <w:rFonts w:ascii="Calibri" w:eastAsia="Calibri" w:hAnsi="Calibri" w:cs="Calibri"/>
+              </w:rPr>
+              <w:t>As expected</w:t>
+            </w:r>
+          </w:p>
+        </w:tc>
+      </w:tr>
+      <w:tr>
+        <w:tc>
+          <w:tcPr>
+            <w:tcW w:w="700" w:type="dxa"/>
+            <w:tcMar>
+              <w:top w:w="80" w:type="dxa"/>
+              <w:left w:w="100" w:type="dxa"/>
+              <w:bottom w:w="80" w:type="dxa"/>
+              <w:right w:w="100" w:type="dxa"/>
+            </w:tcMar>
+          </w:tcPr>
+          <w:p>
+            <w:r>
+              <w:rPr>
+                <w:rFonts w:ascii="Calibri" w:eastAsia="Calibri" w:hAnsi="Calibri" w:cs="Calibri"/>
+              </w:rPr>
+              <w:t>13</w:t>
+            </w:r>
+          </w:p>
+        </w:tc>
+        <w:tc>
+          <w:tcPr>
+            <w:tcW w:w="3300" w:type="dxa"/>
+            <w:tcMar>
+              <w:top w:w="80" w:type="dxa"/>
+              <w:left w:w="100" w:type="dxa"/>
+              <w:bottom w:w="80" w:type="dxa"/>
+              <w:right w:w="100" w:type="dxa"/>
+            </w:tcMar>
+          </w:tcPr>
+          <w:p>
+            <w:r>
+              <w:rPr>
+                <w:rFonts w:ascii="Calibri" w:eastAsia="Calibri" w:hAnsi="Calibri" w:cs="Calibri"/>
+              </w:rPr>
+              <w:t>Process next service request (Dequeue)</w:t>
+            </w:r>
+          </w:p>
+        </w:tc>
+        <w:tc>
+          <w:tcPr>
+            <w:tcW w:w="2500" w:type="dxa"/>
+            <w:tcMar>
+              <w:top w:w="80" w:type="dxa"/>
+              <w:left w:w="100" w:type="dxa"/>
+              <w:bottom w:w="80" w:type="dxa"/>
+              <w:right w:w="100" w:type="dxa"/>
+            </w:tcMar>
+          </w:tcPr>
+          <w:p>
+            <w:r>
+              <w:rPr>
+                <w:rFonts w:ascii="Calibri" w:eastAsia="Calibri" w:hAnsi="Calibri" w:cs="Calibri"/>
+              </w:rPr>
+              <w:t>Oldest request removed and displayed as processed, queue updated</w:t>
             </w:r>
           </w:p>
         </w:tc>
@@ -3727,12 +3884,6 @@
         <w:gridCol w:w="1300"/>
       </w:tblGrid>
       <w:tr>
-        <w:tblPrEx>
-          <w:tblCellMar>
-            <w:top w:w="0" w:type="dxa"/>
-            <w:bottom w:w="0" w:type="dxa"/>
-          </w:tblCellMar>
-        </w:tblPrEx>
         <w:tc>
           <w:tcPr>
             <w:tcW w:w="2600" w:type="dxa"/>
@@ -3845,12 +3996,6 @@
         </w:tc>
       </w:tr>
       <w:tr>
-        <w:tblPrEx>
-          <w:tblCellMar>
-            <w:top w:w="0" w:type="dxa"/>
-            <w:bottom w:w="0" w:type="dxa"/>
-          </w:tblCellMar>
-        </w:tblPrEx>
         <w:tc>
           <w:tcPr>
             <w:tcW w:w="2600" w:type="dxa"/>
@@ -3948,12 +4093,6 @@
         </w:tc>
       </w:tr>
       <w:tr>
-        <w:tblPrEx>
-          <w:tblCellMar>
-            <w:top w:w="0" w:type="dxa"/>
-            <w:bottom w:w="0" w:type="dxa"/>
-          </w:tblCellMar>
-        </w:tblPrEx>
         <w:tc>
           <w:tcPr>
             <w:tcW w:w="2600" w:type="dxa"/>
@@ -3969,7 +4108,6 @@
               <w:rPr>
                 <w:rFonts w:ascii="Calibri" w:eastAsia="Calibri" w:hAnsi="Calibri" w:cs="Calibri"/>
               </w:rPr>
-              <w:lastRenderedPageBreak/>
               <w:t>Binary Search</w:t>
             </w:r>
           </w:p>
@@ -4052,12 +4190,6 @@
         </w:tc>
       </w:tr>
       <w:tr>
-        <w:tblPrEx>
-          <w:tblCellMar>
-            <w:top w:w="0" w:type="dxa"/>
-            <w:bottom w:w="0" w:type="dxa"/>
-          </w:tblCellMar>
-        </w:tblPrEx>
         <w:tc>
           <w:tcPr>
             <w:tcW w:w="2600" w:type="dxa"/>
@@ -4155,12 +4287,6 @@
         </w:tc>
       </w:tr>
       <w:tr>
-        <w:tblPrEx>
-          <w:tblCellMar>
-            <w:top w:w="0" w:type="dxa"/>
-            <w:bottom w:w="0" w:type="dxa"/>
-          </w:tblCellMar>
-        </w:tblPrEx>
         <w:tc>
           <w:tcPr>
             <w:tcW w:w="2600" w:type="dxa"/>
@@ -4176,7 +4302,7 @@
               <w:rPr>
                 <w:rFonts w:ascii="Calibri" w:eastAsia="Calibri" w:hAnsi="Calibri" w:cs="Calibri"/>
               </w:rPr>
-              <w:t>Find Customer (file scan)</w:t>
+              <w:t>Linked List Traversal</w:t>
             </w:r>
           </w:p>
         </w:tc>
@@ -4252,18 +4378,12 @@
               <w:rPr>
                 <w:rFonts w:ascii="Calibri" w:eastAsia="Calibri" w:hAnsi="Calibri" w:cs="Calibri"/>
               </w:rPr>
-              <w:t>O(1)</w:t>
+              <w:t>O(n)</w:t>
             </w:r>
           </w:p>
         </w:tc>
       </w:tr>
       <w:tr>
-        <w:tblPrEx>
-          <w:tblCellMar>
-            <w:top w:w="0" w:type="dxa"/>
-            <w:bottom w:w="0" w:type="dxa"/>
-          </w:tblCellMar>
-        </w:tblPrEx>
         <w:tc>
           <w:tcPr>
             <w:tcW w:w="2600" w:type="dxa"/>
@@ -4279,7 +4399,7 @@
               <w:rPr>
                 <w:rFonts w:ascii="Calibri" w:eastAsia="Calibri" w:hAnsi="Calibri" w:cs="Calibri"/>
               </w:rPr>
-              <w:t>Update/Delete Customer</w:t>
+              <w:t>Queue Enqueue / Dequeue</w:t>
             </w:r>
           </w:p>
         </w:tc>
@@ -4298,7 +4418,7 @@
               <w:rPr>
                 <w:rFonts w:ascii="Calibri" w:eastAsia="Calibri" w:hAnsi="Calibri" w:cs="Calibri"/>
               </w:rPr>
-              <w:t>O(n)</w:t>
+              <w:t>O(1)</w:t>
             </w:r>
           </w:p>
         </w:tc>
@@ -4317,7 +4437,7 @@
               <w:rPr>
                 <w:rFonts w:ascii="Calibri" w:eastAsia="Calibri" w:hAnsi="Calibri" w:cs="Calibri"/>
               </w:rPr>
-              <w:t>O(n)</w:t>
+              <w:t>O(1)</w:t>
             </w:r>
           </w:p>
         </w:tc>
@@ -4336,7 +4456,7 @@
               <w:rPr>
                 <w:rFonts w:ascii="Calibri" w:eastAsia="Calibri" w:hAnsi="Calibri" w:cs="Calibri"/>
               </w:rPr>
-              <w:t>O(n)</w:t>
+              <w:t>O(1)</w:t>
             </w:r>
           </w:p>
         </w:tc>
@@ -4355,18 +4475,12 @@
               <w:rPr>
                 <w:rFonts w:ascii="Calibri" w:eastAsia="Calibri" w:hAnsi="Calibri" w:cs="Calibri"/>
               </w:rPr>
-              <w:t>O(n)</w:t>
+              <w:t>O(1)</w:t>
             </w:r>
           </w:p>
         </w:tc>
       </w:tr>
       <w:tr>
-        <w:tblPrEx>
-          <w:tblCellMar>
-            <w:top w:w="0" w:type="dxa"/>
-            <w:bottom w:w="0" w:type="dxa"/>
-          </w:tblCellMar>
-        </w:tblPrEx>
         <w:tc>
           <w:tcPr>
             <w:tcW w:w="2600" w:type="dxa"/>
@@ -4382,6 +4496,201 @@
               <w:rPr>
                 <w:rFonts w:ascii="Calibri" w:eastAsia="Calibri" w:hAnsi="Calibri" w:cs="Calibri"/>
               </w:rPr>
+              <w:t>Find Customer (file scan)</w:t>
+            </w:r>
+          </w:p>
+        </w:tc>
+        <w:tc>
+          <w:tcPr>
+            <w:tcW w:w="1500" w:type="dxa"/>
+            <w:tcMar>
+              <w:top w:w="80" w:type="dxa"/>
+              <w:left w:w="100" w:type="dxa"/>
+              <w:bottom w:w="80" w:type="dxa"/>
+              <w:right w:w="100" w:type="dxa"/>
+            </w:tcMar>
+          </w:tcPr>
+          <w:p>
+            <w:r>
+              <w:rPr>
+                <w:rFonts w:ascii="Calibri" w:eastAsia="Calibri" w:hAnsi="Calibri" w:cs="Calibri"/>
+              </w:rPr>
+              <w:t>O(1)</w:t>
+            </w:r>
+          </w:p>
+        </w:tc>
+        <w:tc>
+          <w:tcPr>
+            <w:tcW w:w="1500" w:type="dxa"/>
+            <w:tcMar>
+              <w:top w:w="80" w:type="dxa"/>
+              <w:left w:w="100" w:type="dxa"/>
+              <w:bottom w:w="80" w:type="dxa"/>
+              <w:right w:w="100" w:type="dxa"/>
+            </w:tcMar>
+          </w:tcPr>
+          <w:p>
+            <w:r>
+              <w:rPr>
+                <w:rFonts w:ascii="Calibri" w:eastAsia="Calibri" w:hAnsi="Calibri" w:cs="Calibri"/>
+              </w:rPr>
+              <w:t>O(n)</w:t>
+            </w:r>
+          </w:p>
+        </w:tc>
+        <w:tc>
+          <w:tcPr>
+            <w:tcW w:w="1500" w:type="dxa"/>
+            <w:tcMar>
+              <w:top w:w="80" w:type="dxa"/>
+              <w:left w:w="100" w:type="dxa"/>
+              <w:bottom w:w="80" w:type="dxa"/>
+              <w:right w:w="100" w:type="dxa"/>
+            </w:tcMar>
+          </w:tcPr>
+          <w:p>
+            <w:r>
+              <w:rPr>
+                <w:rFonts w:ascii="Calibri" w:eastAsia="Calibri" w:hAnsi="Calibri" w:cs="Calibri"/>
+              </w:rPr>
+              <w:t>O(n)</w:t>
+            </w:r>
+          </w:p>
+        </w:tc>
+        <w:tc>
+          <w:tcPr>
+            <w:tcW w:w="1300" w:type="dxa"/>
+            <w:tcMar>
+              <w:top w:w="80" w:type="dxa"/>
+              <w:left w:w="100" w:type="dxa"/>
+              <w:bottom w:w="80" w:type="dxa"/>
+              <w:right w:w="100" w:type="dxa"/>
+            </w:tcMar>
+          </w:tcPr>
+          <w:p>
+            <w:r>
+              <w:rPr>
+                <w:rFonts w:ascii="Calibri" w:eastAsia="Calibri" w:hAnsi="Calibri" w:cs="Calibri"/>
+              </w:rPr>
+              <w:t>O(1)</w:t>
+            </w:r>
+          </w:p>
+        </w:tc>
+      </w:tr>
+      <w:tr>
+        <w:tc>
+          <w:tcPr>
+            <w:tcW w:w="2600" w:type="dxa"/>
+            <w:tcMar>
+              <w:top w:w="80" w:type="dxa"/>
+              <w:left w:w="100" w:type="dxa"/>
+              <w:bottom w:w="80" w:type="dxa"/>
+              <w:right w:w="100" w:type="dxa"/>
+            </w:tcMar>
+          </w:tcPr>
+          <w:p>
+            <w:r>
+              <w:rPr>
+                <w:rFonts w:ascii="Calibri" w:eastAsia="Calibri" w:hAnsi="Calibri" w:cs="Calibri"/>
+              </w:rPr>
+              <w:t>Update/Delete Customer</w:t>
+            </w:r>
+          </w:p>
+        </w:tc>
+        <w:tc>
+          <w:tcPr>
+            <w:tcW w:w="1500" w:type="dxa"/>
+            <w:tcMar>
+              <w:top w:w="80" w:type="dxa"/>
+              <w:left w:w="100" w:type="dxa"/>
+              <w:bottom w:w="80" w:type="dxa"/>
+              <w:right w:w="100" w:type="dxa"/>
+            </w:tcMar>
+          </w:tcPr>
+          <w:p>
+            <w:r>
+              <w:rPr>
+                <w:rFonts w:ascii="Calibri" w:eastAsia="Calibri" w:hAnsi="Calibri" w:cs="Calibri"/>
+              </w:rPr>
+              <w:t>O(n)</w:t>
+            </w:r>
+          </w:p>
+        </w:tc>
+        <w:tc>
+          <w:tcPr>
+            <w:tcW w:w="1500" w:type="dxa"/>
+            <w:tcMar>
+              <w:top w:w="80" w:type="dxa"/>
+              <w:left w:w="100" w:type="dxa"/>
+              <w:bottom w:w="80" w:type="dxa"/>
+              <w:right w:w="100" w:type="dxa"/>
+            </w:tcMar>
+          </w:tcPr>
+          <w:p>
+            <w:r>
+              <w:rPr>
+                <w:rFonts w:ascii="Calibri" w:eastAsia="Calibri" w:hAnsi="Calibri" w:cs="Calibri"/>
+              </w:rPr>
+              <w:t>O(n)</w:t>
+            </w:r>
+          </w:p>
+        </w:tc>
+        <w:tc>
+          <w:tcPr>
+            <w:tcW w:w="1500" w:type="dxa"/>
+            <w:tcMar>
+              <w:top w:w="80" w:type="dxa"/>
+              <w:left w:w="100" w:type="dxa"/>
+              <w:bottom w:w="80" w:type="dxa"/>
+              <w:right w:w="100" w:type="dxa"/>
+            </w:tcMar>
+          </w:tcPr>
+          <w:p>
+            <w:r>
+              <w:rPr>
+                <w:rFonts w:ascii="Calibri" w:eastAsia="Calibri" w:hAnsi="Calibri" w:cs="Calibri"/>
+              </w:rPr>
+              <w:t>O(n)</w:t>
+            </w:r>
+          </w:p>
+        </w:tc>
+        <w:tc>
+          <w:tcPr>
+            <w:tcW w:w="1300" w:type="dxa"/>
+            <w:tcMar>
+              <w:top w:w="80" w:type="dxa"/>
+              <w:left w:w="100" w:type="dxa"/>
+              <w:bottom w:w="80" w:type="dxa"/>
+              <w:right w:w="100" w:type="dxa"/>
+            </w:tcMar>
+          </w:tcPr>
+          <w:p>
+            <w:r>
+              <w:rPr>
+                <w:rFonts w:ascii="Calibri" w:eastAsia="Calibri" w:hAnsi="Calibri" w:cs="Calibri"/>
+              </w:rPr>
+              <w:t>O(n)</w:t>
+            </w:r>
+          </w:p>
+        </w:tc>
+      </w:tr>
+      <w:tr>
+        <w:tc>
+          <w:tcPr>
+            <w:tcW w:w="2600" w:type="dxa"/>
+            <w:tcMar>
+              <w:top w:w="80" w:type="dxa"/>
+              <w:left w:w="100" w:type="dxa"/>
+              <w:bottom w:w="80" w:type="dxa"/>
+              <w:right w:w="100" w:type="dxa"/>
+            </w:tcMar>
+          </w:tcPr>
+          <w:p>
+            <w:r>
+              <w:rPr>
+                <w:rFonts w:ascii="Calibri" w:eastAsia="Calibri" w:hAnsi="Calibri" w:cs="Calibri"/>
+              </w:rPr>
+              <w:lastRenderedPageBreak/>
               <w:t>Deposit / Withdraw</w:t>
             </w:r>
           </w:p>
@@ -4553,7 +4862,7 @@
           <w:sz w:val="22"/>
           <w:szCs w:val="22"/>
         </w:rPr>
-        <w:t>data/ – binary data files (customer.dat, employee.dat, transaction.dat)</w:t>
+        <w:t>data/ – binary data files (customer.dat, employee.dat, transaction.dat, queue.dat)</w:t>
       </w:r>
     </w:p>
     <w:p>
@@ -4609,7 +4918,7 @@
           <w:sz w:val="22"/>
           <w:szCs w:val="22"/>
         </w:rPr>
-        <w:t>The final SBMS application works as expected. An administrator can log in and manage both customers and employees, view reports about the bank, and run the DSA module to search or sort customer records. An employee can create accounts and handle basic transactions. A customer can log in with their account number and PIN to check their balance, deposit or withdraw money, transfer funds to another account, view a short statement of recent transactions, and change their PIN.</w:t>
+        <w:t>The final SBMS application works as expected. An administrator can log in and manage both customers and employees, view reports about the bank, and run the DSA module to search, sort, traverse customer records via a linked list, and manage customer service requests via a queue. An employee can create accounts and handle basic transactions. A customer can log in with their account number and PIN to check their balance, deposit or withdraw money, transfer funds to another account, view a short statement of recent transactions, and change their PIN.</w:t>
       </w:r>
     </w:p>
     <w:p>
@@ -4635,7 +4944,7 @@
           <w:sz w:val="22"/>
           <w:szCs w:val="22"/>
         </w:rPr>
-        <w:t>One limitation I noticed is that the linked list, stack and queue structures mentioned as possible concepts in the project guideline are not implemented in this version — the project currently relies mainly on arrays, structures, file handling, searching and sorting. This is something I would like to improve in a future version.</w:t>
+        <w:t>In addition to arrays, structures, file handling, searching and sorting, a singly linked list and a linked-list based queue have now been implemented. The linked list is used to dynamically load and traverse customer records, and the queue is used to manage customer service requests (such as cheque book or statement requests) in first-in-first-out order, with the queue's state persisted in queue.dat. A stack, also mentioned as a possible concept in the project guideline, is not yet implemented and remains a planned improvement.</w:t>
       </w:r>
     </w:p>
     <w:p>
@@ -4647,7 +4956,6 @@
         <w:rPr>
           <w:rFonts w:ascii="Calibri" w:eastAsia="Calibri" w:hAnsi="Calibri" w:cs="Calibri"/>
         </w:rPr>
-        <w:lastRenderedPageBreak/>
         <w:t>12: Conclusion &amp; Future Scope</w:t>
       </w:r>
     </w:p>
@@ -4662,6 +4970,7 @@
           <w:b/>
           <w:bCs/>
         </w:rPr>
+        <w:lastRenderedPageBreak/>
         <w:t>12.1 Conclusion</w:t>
       </w:r>
     </w:p>
@@ -4675,43 +4984,7 @@
           <w:sz w:val="22"/>
           <w:szCs w:val="22"/>
         </w:rPr>
-        <w:t xml:space="preserve">This project helped me understand how the data structures and algorithms I learned in theory can </w:t>
-      </w:r>
-      <w:proofErr w:type="gramStart"/>
-      <w:r>
-        <w:rPr>
-          <w:rFonts w:ascii="Calibri" w:eastAsia="Calibri" w:hAnsi="Calibri" w:cs="Calibri"/>
-          <w:sz w:val="22"/>
-          <w:szCs w:val="22"/>
-        </w:rPr>
-        <w:t>actually be</w:t>
-      </w:r>
-      <w:proofErr w:type="gramEnd"/>
-      <w:r>
-        <w:rPr>
-          <w:rFonts w:ascii="Calibri" w:eastAsia="Calibri" w:hAnsi="Calibri" w:cs="Calibri"/>
-          <w:sz w:val="22"/>
-          <w:szCs w:val="22"/>
-        </w:rPr>
-        <w:t xml:space="preserve"> used to build a working application. Building SBMS gave me practice with structures, arrays, pointers, file handling, searching and sorting, </w:t>
-      </w:r>
-      <w:proofErr w:type="gramStart"/>
-      <w:r>
-        <w:rPr>
-          <w:rFonts w:ascii="Calibri" w:eastAsia="Calibri" w:hAnsi="Calibri" w:cs="Calibri"/>
-          <w:sz w:val="22"/>
-          <w:szCs w:val="22"/>
-        </w:rPr>
-        <w:t>and also</w:t>
-      </w:r>
-      <w:proofErr w:type="gramEnd"/>
-      <w:r>
-        <w:rPr>
-          <w:rFonts w:ascii="Calibri" w:eastAsia="Calibri" w:hAnsi="Calibri" w:cs="Calibri"/>
-          <w:sz w:val="22"/>
-          <w:szCs w:val="22"/>
-        </w:rPr>
-        <w:t xml:space="preserve"> with organising a C project into multiple files, which is closer to how real software projects are structured.</w:t>
+        <w:t>This project helped me understand how the data structures and algorithms I learned in theory can actually be used to build a working application. Building SBMS gave me practice with structures, arrays, pointers, file handling, searching and sorting, and also with organising a C project into multiple files, which is closer to how real software projects are structured.</w:t>
       </w:r>
     </w:p>
     <w:p>
@@ -4743,7 +5016,7 @@
           <w:sz w:val="22"/>
           <w:szCs w:val="22"/>
         </w:rPr>
-        <w:t>Add a linked list to store transactions instead of only a flat binary file, so a stack (undo) and queue (pending requests) can also be added as suggested in the project guideline.</w:t>
+        <w:t>Add a Stack to support undo functionality for recent transactions, as suggested in the project guideline (the linked list and queue concepts have already been implemented).</w:t>
       </w:r>
     </w:p>
     <w:p>
@@ -4867,13 +5140,7 @@
         <w:rPr>
           <w:rFonts w:ascii="Calibri" w:eastAsia="Calibri" w:hAnsi="Calibri" w:cs="Calibri"/>
         </w:rPr>
-        <w:t>2</w:t>
-      </w:r>
-      <w:r>
-        <w:rPr>
-          <w:rFonts w:ascii="Calibri" w:eastAsia="Calibri" w:hAnsi="Calibri" w:cs="Calibri"/>
-        </w:rPr>
-        <w:t>. Course lecture notes and lab material for Data Structures &amp; Algorithms Using C.</w:t>
+        <w:t>2. Course lecture notes and lab material for Data Structures &amp; Algorithms Using C.</w:t>
       </w:r>
     </w:p>
     <w:p>
@@ -4884,13 +5151,7 @@
         <w:rPr>
           <w:rFonts w:ascii="Calibri" w:eastAsia="Calibri" w:hAnsi="Calibri" w:cs="Calibri"/>
         </w:rPr>
-        <w:t>3</w:t>
-      </w:r>
-      <w:r>
-        <w:rPr>
-          <w:rFonts w:ascii="Calibri" w:eastAsia="Calibri" w:hAnsi="Calibri" w:cs="Calibri"/>
-        </w:rPr>
-        <w:t>. GeeksforGeeks – articles on Linear Search, Binary Search and Bubble Sort (used for revising concepts).</w:t>
+        <w:t>3. GeeksforGeeks – articles on Linear Search, Binary Search and Bubble Sort (used for revising concepts).</w:t>
       </w:r>
     </w:p>
     <w:sectPr>
@@ -5649,6 +5910,7 @@
   <w:style w:type="character" w:default="1" w:styleId="DefaultParagraphFont">
     <w:name w:val="Default Paragraph Font"/>
     <w:uiPriority w:val="1"/>
+    <w:semiHidden/>
     <w:unhideWhenUsed/>
   </w:style>
   <w:style w:type="table" w:default="1" w:styleId="TableNormal">

</xml_diff>